<commit_message>
Norway gas - better estimate
</commit_message>
<xml_diff>
--- a/Code Development and Calc Flowsheet.docx
+++ b/Code Development and Calc Flowsheet.docx
@@ -163,7 +163,16 @@
         <w:t xml:space="preserve">further </w:t>
       </w:r>
       <w:r>
-        <w:t>in ASSUMPTIONS.txt</w:t>
+        <w:t>in ASSUMPTIONS</w:t>
+      </w:r>
+      <w:r>
+        <w:t>_README</w:t>
+      </w:r>
+      <w:r>
+        <w:t>.txt</w:t>
+      </w:r>
+      <w:r>
+        <w:t xml:space="preserve"> and SCENARIO_ASSUMPTIONS_README.txt</w:t>
       </w:r>
     </w:p>
     <w:p>
@@ -179,6 +188,7 @@
           <w:sz w:val="28"/>
           <w:szCs w:val="28"/>
         </w:rPr>
+        <w:lastRenderedPageBreak/>
         <w:t>Results</w:t>
       </w:r>
       <w:r>
@@ -204,7 +214,6 @@
     </w:p>
     <w:p>
       <w:r>
-        <w:lastRenderedPageBreak/>
         <w:t>C:\Users\Joe\OneDrive - Heriot-Watt University\Uni_Cloud\Year 5\B41HE_MEng_Design\Group\North_Sea_Feedstock_Model</w:t>
       </w:r>
     </w:p>
@@ -286,6 +295,38 @@
       </w:r>
     </w:p>
     <w:p>
+      <w:r>
+        <w:t>With Jackdaw and Rosebank approved, the graph looks something like this:</w:t>
+      </w:r>
+    </w:p>
+    <w:p>
+      <w:r>
+        <w:rPr>
+          <w:noProof/>
+        </w:rPr>
+        <w:lastRenderedPageBreak/>
+        <w:drawing>
+          <wp:inline distT="0" distB="0" distL="0" distR="0" wp14:anchorId="60BEB7C4" wp14:editId="3D1A94E8">
+            <wp:extent cx="5731510" cy="3768725"/>
+            <wp:effectExtent l="0" t="0" r="2540" b="3175"/>
+            <wp:docPr id="2084999701" name="Chart 1">
+              <a:extLst xmlns:a="http://schemas.openxmlformats.org/drawingml/2006/main">
+                <a:ext uri="{FF2B5EF4-FFF2-40B4-BE49-F238E27FC236}">
+                  <a16:creationId xmlns:a16="http://schemas.microsoft.com/office/drawing/2014/main" id="{CBF4C3BE-B004-482C-8AC1-8BE8AFE4B8B6}"/>
+                </a:ext>
+              </a:extLst>
+            </wp:docPr>
+            <wp:cNvGraphicFramePr/>
+            <a:graphic xmlns:a="http://schemas.openxmlformats.org/drawingml/2006/main">
+              <a:graphicData uri="http://schemas.openxmlformats.org/drawingml/2006/chart">
+                <c:chart xmlns:c="http://schemas.openxmlformats.org/drawingml/2006/chart" xmlns:r="http://schemas.openxmlformats.org/officeDocument/2006/relationships" r:id="rId8"/>
+              </a:graphicData>
+            </a:graphic>
+          </wp:inline>
+        </w:drawing>
+      </w:r>
+    </w:p>
+    <w:p>
       <w:pPr>
         <w:pStyle w:val="Heading3"/>
       </w:pPr>
@@ -353,7 +394,6 @@
             <w:rPr>
               <w:rFonts w:ascii="Cambria Math" w:hAnsi="Cambria Math"/>
             </w:rPr>
-            <w:lastRenderedPageBreak/>
             <m:t>ln(F</m:t>
           </m:r>
           <m:r>
@@ -449,6 +489,7 @@
     </w:p>
     <w:p>
       <w:r>
+        <w:lastRenderedPageBreak/>
         <w:t>This indicates that an exponential decline provides a very good representation of the overall projected decline in NGL feedstock over the project period.</w:t>
       </w:r>
     </w:p>
@@ -741,13 +782,7 @@
             <w:rPr>
               <w:rFonts w:ascii="Cambria Math" w:hAnsi="Cambria Math"/>
             </w:rPr>
-            <m:t xml:space="preserve"> =</m:t>
-          </m:r>
-          <m:r>
-            <w:rPr>
-              <w:rFonts w:ascii="Cambria Math" w:hAnsi="Cambria Math"/>
-            </w:rPr>
-            <m:t xml:space="preserve"> </m:t>
+            <m:t xml:space="preserve"> = </m:t>
           </m:r>
           <m:sSub>
             <m:sSubPr>
@@ -815,11 +850,7 @@
     </w:p>
     <w:p>
       <w:r>
-        <w:t xml:space="preserve">The 6.11% per year decline rate represents a single average exponential decline across the full 2028–2063 projection period. The actual year-to-year decline in the underlying feedstock projection is not constant because the UK and Norwegian contributions to the Fife NGL system follow different decline profiles. However, the high R² value of </w:t>
-      </w:r>
-      <w:r>
-        <w:lastRenderedPageBreak/>
-        <w:t>0.9923 demonstrates that the exponential relationship provides a suitable simplified representation of the overall long-term trend.</w:t>
+        <w:t>The 6.11% per year decline rate represents a single average exponential decline across the full 2028–2063 projection period. The actual year-to-year decline in the underlying feedstock projection is not constant because the UK and Norwegian contributions to the Fife NGL system follow different decline profiles. However, the high R² value of 0.9923 demonstrates that the exponential relationship provides a suitable simplified representation of the overall long-term trend.</w:t>
       </w:r>
     </w:p>
     <w:p>
@@ -1596,6 +1627,7 @@
   <w:style w:type="character" w:default="1" w:styleId="DefaultParagraphFont">
     <w:name w:val="Default Paragraph Font"/>
     <w:uiPriority w:val="1"/>
+    <w:semiHidden/>
     <w:unhideWhenUsed/>
   </w:style>
   <w:style w:type="table" w:default="1" w:styleId="TableNormal">
@@ -1930,7 +1962,1672 @@
       <w:shd w:val="clear" w:color="auto" w:fill="E1DFDD"/>
     </w:rPr>
   </w:style>
+  <w:style w:type="character" w:styleId="FollowedHyperlink">
+    <w:name w:val="FollowedHyperlink"/>
+    <w:basedOn w:val="DefaultParagraphFont"/>
+    <w:uiPriority w:val="99"/>
+    <w:semiHidden/>
+    <w:unhideWhenUsed/>
+    <w:rsid w:val="00AE7E11"/>
+    <w:rPr>
+      <w:color w:val="96607D" w:themeColor="followedHyperlink"/>
+      <w:u w:val="single"/>
+    </w:rPr>
+  </w:style>
 </w:styles>
+</file>
+
+<file path=word/charts/chart1.xml><?xml version="1.0" encoding="utf-8"?>
+<c:chartSpace xmlns:c="http://schemas.openxmlformats.org/drawingml/2006/chart" xmlns:a="http://schemas.openxmlformats.org/drawingml/2006/main" xmlns:r="http://schemas.openxmlformats.org/officeDocument/2006/relationships" xmlns:c16r2="http://schemas.microsoft.com/office/drawing/2015/06/chart">
+  <c:date1904 val="0"/>
+  <c:lang val="en-US"/>
+  <c:roundedCorners val="0"/>
+  <mc:AlternateContent xmlns:mc="http://schemas.openxmlformats.org/markup-compatibility/2006">
+    <mc:Choice xmlns:c14="http://schemas.microsoft.com/office/drawing/2007/8/2/chart" Requires="c14">
+      <c14:style val="102"/>
+    </mc:Choice>
+    <mc:Fallback>
+      <c:style val="2"/>
+    </mc:Fallback>
+  </mc:AlternateContent>
+  <c:chart>
+    <c:title>
+      <c:tx>
+        <c:rich>
+          <a:bodyPr rot="0" spcFirstLastPara="1" vertOverflow="ellipsis" vert="horz" wrap="square" anchor="ctr" anchorCtr="1"/>
+          <a:lstStyle/>
+          <a:p>
+            <a:pPr>
+              <a:defRPr sz="1400" b="0" i="0" u="none" strike="noStrike" kern="1200" spc="0" baseline="0">
+                <a:solidFill>
+                  <a:schemeClr val="tx1">
+                    <a:lumMod val="65000"/>
+                    <a:lumOff val="35000"/>
+                  </a:schemeClr>
+                </a:solidFill>
+                <a:latin typeface="+mn-lt"/>
+                <a:ea typeface="+mn-ea"/>
+                <a:cs typeface="+mn-cs"/>
+              </a:defRPr>
+            </a:pPr>
+            <a:r>
+              <a:rPr lang="en-GB"/>
+              <a:t>Throughput at Shell NGL plant</a:t>
+            </a:r>
+            <a:r>
+              <a:rPr lang="en-GB" baseline="0"/>
+              <a:t> (kt/y)</a:t>
+            </a:r>
+            <a:endParaRPr lang="en-GB"/>
+          </a:p>
+        </c:rich>
+      </c:tx>
+      <c:overlay val="0"/>
+      <c:spPr>
+        <a:noFill/>
+        <a:ln>
+          <a:noFill/>
+        </a:ln>
+        <a:effectLst/>
+      </c:spPr>
+      <c:txPr>
+        <a:bodyPr rot="0" spcFirstLastPara="1" vertOverflow="ellipsis" vert="horz" wrap="square" anchor="ctr" anchorCtr="1"/>
+        <a:lstStyle/>
+        <a:p>
+          <a:pPr>
+            <a:defRPr sz="1400" b="0" i="0" u="none" strike="noStrike" kern="1200" spc="0" baseline="0">
+              <a:solidFill>
+                <a:schemeClr val="tx1">
+                  <a:lumMod val="65000"/>
+                  <a:lumOff val="35000"/>
+                </a:schemeClr>
+              </a:solidFill>
+              <a:latin typeface="+mn-lt"/>
+              <a:ea typeface="+mn-ea"/>
+              <a:cs typeface="+mn-cs"/>
+            </a:defRPr>
+          </a:pPr>
+          <a:endParaRPr lang="en-GB"/>
+        </a:p>
+      </c:txPr>
+    </c:title>
+    <c:autoTitleDeleted val="0"/>
+    <c:plotArea>
+      <c:layout/>
+      <c:scatterChart>
+        <c:scatterStyle val="lineMarker"/>
+        <c:varyColors val="0"/>
+        <c:ser>
+          <c:idx val="0"/>
+          <c:order val="0"/>
+          <c:tx>
+            <c:strRef>
+              <c:f>'Rosebank + Jackdaw'!$B$1</c:f>
+              <c:strCache>
+                <c:ptCount val="1"/>
+                <c:pt idx="0">
+                  <c:v>ethane_ktpa</c:v>
+                </c:pt>
+              </c:strCache>
+            </c:strRef>
+          </c:tx>
+          <c:spPr>
+            <a:ln w="19050" cap="rnd">
+              <a:solidFill>
+                <a:schemeClr val="accent1"/>
+              </a:solidFill>
+              <a:round/>
+            </a:ln>
+            <a:effectLst/>
+          </c:spPr>
+          <c:marker>
+            <c:symbol val="none"/>
+          </c:marker>
+          <c:xVal>
+            <c:numRef>
+              <c:f>'Rosebank + Jackdaw'!$A$2:$A$37</c:f>
+              <c:numCache>
+                <c:formatCode>General</c:formatCode>
+                <c:ptCount val="36"/>
+                <c:pt idx="0">
+                  <c:v>2028</c:v>
+                </c:pt>
+                <c:pt idx="1">
+                  <c:v>2029</c:v>
+                </c:pt>
+                <c:pt idx="2">
+                  <c:v>2030</c:v>
+                </c:pt>
+                <c:pt idx="3">
+                  <c:v>2031</c:v>
+                </c:pt>
+                <c:pt idx="4">
+                  <c:v>2032</c:v>
+                </c:pt>
+                <c:pt idx="5">
+                  <c:v>2033</c:v>
+                </c:pt>
+                <c:pt idx="6">
+                  <c:v>2034</c:v>
+                </c:pt>
+                <c:pt idx="7">
+                  <c:v>2035</c:v>
+                </c:pt>
+                <c:pt idx="8">
+                  <c:v>2036</c:v>
+                </c:pt>
+                <c:pt idx="9">
+                  <c:v>2037</c:v>
+                </c:pt>
+                <c:pt idx="10">
+                  <c:v>2038</c:v>
+                </c:pt>
+                <c:pt idx="11">
+                  <c:v>2039</c:v>
+                </c:pt>
+                <c:pt idx="12">
+                  <c:v>2040</c:v>
+                </c:pt>
+                <c:pt idx="13">
+                  <c:v>2041</c:v>
+                </c:pt>
+                <c:pt idx="14">
+                  <c:v>2042</c:v>
+                </c:pt>
+                <c:pt idx="15">
+                  <c:v>2043</c:v>
+                </c:pt>
+                <c:pt idx="16">
+                  <c:v>2044</c:v>
+                </c:pt>
+                <c:pt idx="17">
+                  <c:v>2045</c:v>
+                </c:pt>
+                <c:pt idx="18">
+                  <c:v>2046</c:v>
+                </c:pt>
+                <c:pt idx="19">
+                  <c:v>2047</c:v>
+                </c:pt>
+                <c:pt idx="20">
+                  <c:v>2048</c:v>
+                </c:pt>
+                <c:pt idx="21">
+                  <c:v>2049</c:v>
+                </c:pt>
+                <c:pt idx="22">
+                  <c:v>2050</c:v>
+                </c:pt>
+                <c:pt idx="23">
+                  <c:v>2051</c:v>
+                </c:pt>
+                <c:pt idx="24">
+                  <c:v>2052</c:v>
+                </c:pt>
+                <c:pt idx="25">
+                  <c:v>2053</c:v>
+                </c:pt>
+                <c:pt idx="26">
+                  <c:v>2054</c:v>
+                </c:pt>
+                <c:pt idx="27">
+                  <c:v>2055</c:v>
+                </c:pt>
+                <c:pt idx="28">
+                  <c:v>2056</c:v>
+                </c:pt>
+                <c:pt idx="29">
+                  <c:v>2057</c:v>
+                </c:pt>
+                <c:pt idx="30">
+                  <c:v>2058</c:v>
+                </c:pt>
+                <c:pt idx="31">
+                  <c:v>2059</c:v>
+                </c:pt>
+                <c:pt idx="32">
+                  <c:v>2060</c:v>
+                </c:pt>
+                <c:pt idx="33">
+                  <c:v>2061</c:v>
+                </c:pt>
+                <c:pt idx="34">
+                  <c:v>2062</c:v>
+                </c:pt>
+                <c:pt idx="35">
+                  <c:v>2063</c:v>
+                </c:pt>
+              </c:numCache>
+            </c:numRef>
+          </c:xVal>
+          <c:yVal>
+            <c:numRef>
+              <c:f>'Rosebank + Jackdaw'!$B$2:$B$37</c:f>
+              <c:numCache>
+                <c:formatCode>General</c:formatCode>
+                <c:ptCount val="36"/>
+                <c:pt idx="0">
+                  <c:v>649.45541303849711</c:v>
+                </c:pt>
+                <c:pt idx="1">
+                  <c:v>610.60015339241352</c:v>
+                </c:pt>
+                <c:pt idx="2">
+                  <c:v>555.15639481935443</c:v>
+                </c:pt>
+                <c:pt idx="3">
+                  <c:v>504.99701162992881</c:v>
+                </c:pt>
+                <c:pt idx="4">
+                  <c:v>455.71096249713833</c:v>
+                </c:pt>
+                <c:pt idx="5">
+                  <c:v>417.47892936733638</c:v>
+                </c:pt>
+                <c:pt idx="6">
+                  <c:v>380.97244845150487</c:v>
+                </c:pt>
+                <c:pt idx="7">
+                  <c:v>345.66927238394771</c:v>
+                </c:pt>
+                <c:pt idx="8">
+                  <c:v>314.70225110998041</c:v>
+                </c:pt>
+                <c:pt idx="9">
+                  <c:v>292.24518594094678</c:v>
+                </c:pt>
+                <c:pt idx="10">
+                  <c:v>274.16434076376351</c:v>
+                </c:pt>
+                <c:pt idx="11">
+                  <c:v>255.98356505287549</c:v>
+                </c:pt>
+                <c:pt idx="12">
+                  <c:v>238.07671808295589</c:v>
+                </c:pt>
+                <c:pt idx="13">
+                  <c:v>223.3080184523198</c:v>
+                </c:pt>
+                <c:pt idx="14">
+                  <c:v>208.73908370043421</c:v>
+                </c:pt>
+                <c:pt idx="15">
+                  <c:v>194.44251628860661</c:v>
+                </c:pt>
+                <c:pt idx="16">
+                  <c:v>182.14717545272001</c:v>
+                </c:pt>
+                <c:pt idx="17">
+                  <c:v>169.9156409910747</c:v>
+                </c:pt>
+                <c:pt idx="18">
+                  <c:v>158.84564143646531</c:v>
+                </c:pt>
+                <c:pt idx="19">
+                  <c:v>148.6306264337353</c:v>
+                </c:pt>
+                <c:pt idx="20">
+                  <c:v>139.3933191268606</c:v>
+                </c:pt>
+                <c:pt idx="21">
+                  <c:v>131.3650461264555</c:v>
+                </c:pt>
+                <c:pt idx="22">
+                  <c:v>124.0532467995226</c:v>
+                </c:pt>
+                <c:pt idx="23">
+                  <c:v>117.15052130262499</c:v>
+                </c:pt>
+                <c:pt idx="24">
+                  <c:v>110.9369350060384</c:v>
+                </c:pt>
+                <c:pt idx="25">
+                  <c:v>100.0409922092992</c:v>
+                </c:pt>
+                <c:pt idx="26">
+                  <c:v>94.836159988002663</c:v>
+                </c:pt>
+                <c:pt idx="27">
+                  <c:v>90.047663724425391</c:v>
+                </c:pt>
+                <c:pt idx="28">
+                  <c:v>85.455902951211201</c:v>
+                </c:pt>
+                <c:pt idx="29">
+                  <c:v>81.131981549282528</c:v>
+                </c:pt>
+                <c:pt idx="30">
+                  <c:v>77.104961355978986</c:v>
+                </c:pt>
+                <c:pt idx="31">
+                  <c:v>73.338032302439359</c:v>
+                </c:pt>
+                <c:pt idx="32">
+                  <c:v>69.726724178762453</c:v>
+                </c:pt>
+                <c:pt idx="33">
+                  <c:v>66.320977525219647</c:v>
+                </c:pt>
+                <c:pt idx="34">
+                  <c:v>63.070564105169758</c:v>
+                </c:pt>
+                <c:pt idx="35">
+                  <c:v>60.013044086179598</c:v>
+                </c:pt>
+              </c:numCache>
+            </c:numRef>
+          </c:yVal>
+          <c:smooth val="0"/>
+          <c:extLst>
+            <c:ext xmlns:c16="http://schemas.microsoft.com/office/drawing/2014/chart" uri="{C3380CC4-5D6E-409C-BE32-E72D297353CC}">
+              <c16:uniqueId val="{00000000-3107-4E88-8462-A27D8AF66DDA}"/>
+            </c:ext>
+          </c:extLst>
+        </c:ser>
+        <c:ser>
+          <c:idx val="1"/>
+          <c:order val="1"/>
+          <c:tx>
+            <c:strRef>
+              <c:f>'Rosebank + Jackdaw'!$C$1</c:f>
+              <c:strCache>
+                <c:ptCount val="1"/>
+                <c:pt idx="0">
+                  <c:v>propane_ktpa</c:v>
+                </c:pt>
+              </c:strCache>
+            </c:strRef>
+          </c:tx>
+          <c:spPr>
+            <a:ln w="19050" cap="rnd">
+              <a:solidFill>
+                <a:schemeClr val="accent2"/>
+              </a:solidFill>
+              <a:round/>
+            </a:ln>
+            <a:effectLst/>
+          </c:spPr>
+          <c:marker>
+            <c:symbol val="none"/>
+          </c:marker>
+          <c:xVal>
+            <c:numRef>
+              <c:f>'Rosebank + Jackdaw'!$A$2:$A$37</c:f>
+              <c:numCache>
+                <c:formatCode>General</c:formatCode>
+                <c:ptCount val="36"/>
+                <c:pt idx="0">
+                  <c:v>2028</c:v>
+                </c:pt>
+                <c:pt idx="1">
+                  <c:v>2029</c:v>
+                </c:pt>
+                <c:pt idx="2">
+                  <c:v>2030</c:v>
+                </c:pt>
+                <c:pt idx="3">
+                  <c:v>2031</c:v>
+                </c:pt>
+                <c:pt idx="4">
+                  <c:v>2032</c:v>
+                </c:pt>
+                <c:pt idx="5">
+                  <c:v>2033</c:v>
+                </c:pt>
+                <c:pt idx="6">
+                  <c:v>2034</c:v>
+                </c:pt>
+                <c:pt idx="7">
+                  <c:v>2035</c:v>
+                </c:pt>
+                <c:pt idx="8">
+                  <c:v>2036</c:v>
+                </c:pt>
+                <c:pt idx="9">
+                  <c:v>2037</c:v>
+                </c:pt>
+                <c:pt idx="10">
+                  <c:v>2038</c:v>
+                </c:pt>
+                <c:pt idx="11">
+                  <c:v>2039</c:v>
+                </c:pt>
+                <c:pt idx="12">
+                  <c:v>2040</c:v>
+                </c:pt>
+                <c:pt idx="13">
+                  <c:v>2041</c:v>
+                </c:pt>
+                <c:pt idx="14">
+                  <c:v>2042</c:v>
+                </c:pt>
+                <c:pt idx="15">
+                  <c:v>2043</c:v>
+                </c:pt>
+                <c:pt idx="16">
+                  <c:v>2044</c:v>
+                </c:pt>
+                <c:pt idx="17">
+                  <c:v>2045</c:v>
+                </c:pt>
+                <c:pt idx="18">
+                  <c:v>2046</c:v>
+                </c:pt>
+                <c:pt idx="19">
+                  <c:v>2047</c:v>
+                </c:pt>
+                <c:pt idx="20">
+                  <c:v>2048</c:v>
+                </c:pt>
+                <c:pt idx="21">
+                  <c:v>2049</c:v>
+                </c:pt>
+                <c:pt idx="22">
+                  <c:v>2050</c:v>
+                </c:pt>
+                <c:pt idx="23">
+                  <c:v>2051</c:v>
+                </c:pt>
+                <c:pt idx="24">
+                  <c:v>2052</c:v>
+                </c:pt>
+                <c:pt idx="25">
+                  <c:v>2053</c:v>
+                </c:pt>
+                <c:pt idx="26">
+                  <c:v>2054</c:v>
+                </c:pt>
+                <c:pt idx="27">
+                  <c:v>2055</c:v>
+                </c:pt>
+                <c:pt idx="28">
+                  <c:v>2056</c:v>
+                </c:pt>
+                <c:pt idx="29">
+                  <c:v>2057</c:v>
+                </c:pt>
+                <c:pt idx="30">
+                  <c:v>2058</c:v>
+                </c:pt>
+                <c:pt idx="31">
+                  <c:v>2059</c:v>
+                </c:pt>
+                <c:pt idx="32">
+                  <c:v>2060</c:v>
+                </c:pt>
+                <c:pt idx="33">
+                  <c:v>2061</c:v>
+                </c:pt>
+                <c:pt idx="34">
+                  <c:v>2062</c:v>
+                </c:pt>
+                <c:pt idx="35">
+                  <c:v>2063</c:v>
+                </c:pt>
+              </c:numCache>
+            </c:numRef>
+          </c:xVal>
+          <c:yVal>
+            <c:numRef>
+              <c:f>'Rosebank + Jackdaw'!$C$2:$C$37</c:f>
+              <c:numCache>
+                <c:formatCode>General</c:formatCode>
+                <c:ptCount val="36"/>
+                <c:pt idx="0">
+                  <c:v>740.2963790973522</c:v>
+                </c:pt>
+                <c:pt idx="1">
+                  <c:v>696.006336320885</c:v>
+                </c:pt>
+                <c:pt idx="2">
+                  <c:v>632.80751944883218</c:v>
+                </c:pt>
+                <c:pt idx="3">
+                  <c:v>575.63221686853433</c:v>
+                </c:pt>
+                <c:pt idx="4">
+                  <c:v>519.45240378126357</c:v>
+                </c:pt>
+                <c:pt idx="5">
+                  <c:v>475.87275978521808</c:v>
+                </c:pt>
+                <c:pt idx="6">
+                  <c:v>434.26002534185358</c:v>
+                </c:pt>
+                <c:pt idx="7">
+                  <c:v>394.01890502971952</c:v>
+                </c:pt>
+                <c:pt idx="8">
+                  <c:v>358.72044841466959</c:v>
+                </c:pt>
+                <c:pt idx="9">
+                  <c:v>333.12225692064732</c:v>
+                </c:pt>
+                <c:pt idx="10">
+                  <c:v>312.51239834226448</c:v>
+                </c:pt>
+                <c:pt idx="11">
+                  <c:v>291.78863169447811</c:v>
+                </c:pt>
+                <c:pt idx="12">
+                  <c:v>271.37710889130148</c:v>
+                </c:pt>
+                <c:pt idx="13">
+                  <c:v>254.54267400779659</c:v>
+                </c:pt>
+                <c:pt idx="14">
+                  <c:v>237.9359456202896</c:v>
+                </c:pt>
+                <c:pt idx="15">
+                  <c:v>221.63968127939981</c:v>
+                </c:pt>
+                <c:pt idx="16">
+                  <c:v>207.62456012121311</c:v>
+                </c:pt>
+                <c:pt idx="17">
+                  <c:v>193.68217009570449</c:v>
+                </c:pt>
+                <c:pt idx="18">
+                  <c:v>181.06378179319469</c:v>
+                </c:pt>
+                <c:pt idx="19">
+                  <c:v>169.41996688746249</c:v>
+                </c:pt>
+                <c:pt idx="20">
+                  <c:v>158.8906141180469</c:v>
+                </c:pt>
+                <c:pt idx="21">
+                  <c:v>149.73940633182019</c:v>
+                </c:pt>
+                <c:pt idx="22">
+                  <c:v>141.404887198181</c:v>
+                </c:pt>
+                <c:pt idx="23">
+                  <c:v>133.5366600825601</c:v>
+                </c:pt>
+                <c:pt idx="24">
+                  <c:v>126.4539638046875</c:v>
+                </c:pt>
+                <c:pt idx="25">
+                  <c:v>114.0339780176113</c:v>
+                </c:pt>
+                <c:pt idx="26">
+                  <c:v>108.10113279085721</c:v>
+                </c:pt>
+                <c:pt idx="27">
+                  <c:v>102.64285748191411</c:v>
+                </c:pt>
+                <c:pt idx="28">
+                  <c:v>97.408835552389831</c:v>
+                </c:pt>
+                <c:pt idx="29">
+                  <c:v>92.480116362301871</c:v>
+                </c:pt>
+                <c:pt idx="30">
+                  <c:v>87.889826701450573</c:v>
+                </c:pt>
+                <c:pt idx="31">
+                  <c:v>83.596007783835802</c:v>
+                </c:pt>
+                <c:pt idx="32">
+                  <c:v>79.479576887902397</c:v>
+                </c:pt>
+                <c:pt idx="33">
+                  <c:v>75.597459863201863</c:v>
+                </c:pt>
+                <c:pt idx="34">
+                  <c:v>71.892402922996283</c:v>
+                </c:pt>
+                <c:pt idx="35">
+                  <c:v>68.407219870188428</c:v>
+                </c:pt>
+              </c:numCache>
+            </c:numRef>
+          </c:yVal>
+          <c:smooth val="0"/>
+          <c:extLst>
+            <c:ext xmlns:c16="http://schemas.microsoft.com/office/drawing/2014/chart" uri="{C3380CC4-5D6E-409C-BE32-E72D297353CC}">
+              <c16:uniqueId val="{00000001-3107-4E88-8462-A27D8AF66DDA}"/>
+            </c:ext>
+          </c:extLst>
+        </c:ser>
+        <c:ser>
+          <c:idx val="2"/>
+          <c:order val="2"/>
+          <c:tx>
+            <c:strRef>
+              <c:f>'Rosebank + Jackdaw'!$D$1</c:f>
+              <c:strCache>
+                <c:ptCount val="1"/>
+                <c:pt idx="0">
+                  <c:v>butane_ktpa</c:v>
+                </c:pt>
+              </c:strCache>
+            </c:strRef>
+          </c:tx>
+          <c:spPr>
+            <a:ln w="19050" cap="rnd">
+              <a:solidFill>
+                <a:schemeClr val="accent3"/>
+              </a:solidFill>
+              <a:round/>
+            </a:ln>
+            <a:effectLst/>
+          </c:spPr>
+          <c:marker>
+            <c:symbol val="none"/>
+          </c:marker>
+          <c:xVal>
+            <c:numRef>
+              <c:f>'Rosebank + Jackdaw'!$A$2:$A$37</c:f>
+              <c:numCache>
+                <c:formatCode>General</c:formatCode>
+                <c:ptCount val="36"/>
+                <c:pt idx="0">
+                  <c:v>2028</c:v>
+                </c:pt>
+                <c:pt idx="1">
+                  <c:v>2029</c:v>
+                </c:pt>
+                <c:pt idx="2">
+                  <c:v>2030</c:v>
+                </c:pt>
+                <c:pt idx="3">
+                  <c:v>2031</c:v>
+                </c:pt>
+                <c:pt idx="4">
+                  <c:v>2032</c:v>
+                </c:pt>
+                <c:pt idx="5">
+                  <c:v>2033</c:v>
+                </c:pt>
+                <c:pt idx="6">
+                  <c:v>2034</c:v>
+                </c:pt>
+                <c:pt idx="7">
+                  <c:v>2035</c:v>
+                </c:pt>
+                <c:pt idx="8">
+                  <c:v>2036</c:v>
+                </c:pt>
+                <c:pt idx="9">
+                  <c:v>2037</c:v>
+                </c:pt>
+                <c:pt idx="10">
+                  <c:v>2038</c:v>
+                </c:pt>
+                <c:pt idx="11">
+                  <c:v>2039</c:v>
+                </c:pt>
+                <c:pt idx="12">
+                  <c:v>2040</c:v>
+                </c:pt>
+                <c:pt idx="13">
+                  <c:v>2041</c:v>
+                </c:pt>
+                <c:pt idx="14">
+                  <c:v>2042</c:v>
+                </c:pt>
+                <c:pt idx="15">
+                  <c:v>2043</c:v>
+                </c:pt>
+                <c:pt idx="16">
+                  <c:v>2044</c:v>
+                </c:pt>
+                <c:pt idx="17">
+                  <c:v>2045</c:v>
+                </c:pt>
+                <c:pt idx="18">
+                  <c:v>2046</c:v>
+                </c:pt>
+                <c:pt idx="19">
+                  <c:v>2047</c:v>
+                </c:pt>
+                <c:pt idx="20">
+                  <c:v>2048</c:v>
+                </c:pt>
+                <c:pt idx="21">
+                  <c:v>2049</c:v>
+                </c:pt>
+                <c:pt idx="22">
+                  <c:v>2050</c:v>
+                </c:pt>
+                <c:pt idx="23">
+                  <c:v>2051</c:v>
+                </c:pt>
+                <c:pt idx="24">
+                  <c:v>2052</c:v>
+                </c:pt>
+                <c:pt idx="25">
+                  <c:v>2053</c:v>
+                </c:pt>
+                <c:pt idx="26">
+                  <c:v>2054</c:v>
+                </c:pt>
+                <c:pt idx="27">
+                  <c:v>2055</c:v>
+                </c:pt>
+                <c:pt idx="28">
+                  <c:v>2056</c:v>
+                </c:pt>
+                <c:pt idx="29">
+                  <c:v>2057</c:v>
+                </c:pt>
+                <c:pt idx="30">
+                  <c:v>2058</c:v>
+                </c:pt>
+                <c:pt idx="31">
+                  <c:v>2059</c:v>
+                </c:pt>
+                <c:pt idx="32">
+                  <c:v>2060</c:v>
+                </c:pt>
+                <c:pt idx="33">
+                  <c:v>2061</c:v>
+                </c:pt>
+                <c:pt idx="34">
+                  <c:v>2062</c:v>
+                </c:pt>
+                <c:pt idx="35">
+                  <c:v>2063</c:v>
+                </c:pt>
+              </c:numCache>
+            </c:numRef>
+          </c:xVal>
+          <c:yVal>
+            <c:numRef>
+              <c:f>'Rosebank + Jackdaw'!$D$2:$D$37</c:f>
+              <c:numCache>
+                <c:formatCode>General</c:formatCode>
+                <c:ptCount val="36"/>
+                <c:pt idx="0">
+                  <c:v>528.02748878767329</c:v>
+                </c:pt>
+                <c:pt idx="1">
+                  <c:v>496.43695190827953</c:v>
+                </c:pt>
+                <c:pt idx="2">
+                  <c:v>451.35944847919183</c:v>
+                </c:pt>
+                <c:pt idx="3">
+                  <c:v>410.57830690591948</c:v>
+                </c:pt>
+                <c:pt idx="4">
+                  <c:v>370.5072131350671</c:v>
+                </c:pt>
+                <c:pt idx="5">
+                  <c:v>339.42337883406668</c:v>
+                </c:pt>
+                <c:pt idx="6">
+                  <c:v>309.74247225377309</c:v>
+                </c:pt>
+                <c:pt idx="7">
+                  <c:v>281.03989001187819</c:v>
+                </c:pt>
+                <c:pt idx="8">
+                  <c:v>255.8627367381427</c:v>
+                </c:pt>
+                <c:pt idx="9">
+                  <c:v>237.60444296048661</c:v>
+                </c:pt>
+                <c:pt idx="10">
+                  <c:v>222.90415240566611</c:v>
+                </c:pt>
+                <c:pt idx="11">
+                  <c:v>208.12261521296111</c:v>
+                </c:pt>
+                <c:pt idx="12">
+                  <c:v>193.56379062268661</c:v>
+                </c:pt>
+                <c:pt idx="13">
+                  <c:v>181.5563776085433</c:v>
+                </c:pt>
+                <c:pt idx="14">
+                  <c:v>169.71137966579209</c:v>
+                </c:pt>
+                <c:pt idx="15">
+                  <c:v>158.08782485787569</c:v>
+                </c:pt>
+                <c:pt idx="16">
+                  <c:v>148.09132961736719</c:v>
+                </c:pt>
+                <c:pt idx="17">
+                  <c:v>138.14671094741769</c:v>
+                </c:pt>
+                <c:pt idx="18">
+                  <c:v>129.146456352027</c:v>
+                </c:pt>
+                <c:pt idx="19">
+                  <c:v>120.84133083989239</c:v>
+                </c:pt>
+                <c:pt idx="20">
+                  <c:v>113.3311121513003</c:v>
+                </c:pt>
+                <c:pt idx="21">
+                  <c:v>106.80387602915791</c:v>
+                </c:pt>
+                <c:pt idx="22">
+                  <c:v>100.8591553299235</c:v>
+                </c:pt>
+                <c:pt idx="23">
+                  <c:v>95.247024401850879</c:v>
+                </c:pt>
+                <c:pt idx="24">
+                  <c:v>90.195185118223847</c:v>
+                </c:pt>
+                <c:pt idx="25">
+                  <c:v>81.336444090846697</c:v>
+                </c:pt>
+                <c:pt idx="26">
+                  <c:v>77.104753304693389</c:v>
+                </c:pt>
+                <c:pt idx="27">
+                  <c:v>73.211556625807617</c:v>
+                </c:pt>
+                <c:pt idx="28">
+                  <c:v>69.478312031154715</c:v>
+                </c:pt>
+                <c:pt idx="29">
+                  <c:v>65.962829191626312</c:v>
+                </c:pt>
+                <c:pt idx="30">
+                  <c:v>62.688736286589148</c:v>
+                </c:pt>
+                <c:pt idx="31">
+                  <c:v>59.62610558300311</c:v>
+                </c:pt>
+                <c:pt idx="32">
+                  <c:v>56.689999544772881</c:v>
+                </c:pt>
+                <c:pt idx="33">
+                  <c:v>53.921021387359879</c:v>
+                </c:pt>
+                <c:pt idx="34">
+                  <c:v>51.278333989189022</c:v>
+                </c:pt>
+                <c:pt idx="35">
+                  <c:v>48.792474936922233</c:v>
+                </c:pt>
+              </c:numCache>
+            </c:numRef>
+          </c:yVal>
+          <c:smooth val="0"/>
+          <c:extLst>
+            <c:ext xmlns:c16="http://schemas.microsoft.com/office/drawing/2014/chart" uri="{C3380CC4-5D6E-409C-BE32-E72D297353CC}">
+              <c16:uniqueId val="{00000002-3107-4E88-8462-A27D8AF66DDA}"/>
+            </c:ext>
+          </c:extLst>
+        </c:ser>
+        <c:dLbls>
+          <c:showLegendKey val="0"/>
+          <c:showVal val="0"/>
+          <c:showCatName val="0"/>
+          <c:showSerName val="0"/>
+          <c:showPercent val="0"/>
+          <c:showBubbleSize val="0"/>
+        </c:dLbls>
+        <c:axId val="1473997295"/>
+        <c:axId val="1492851327"/>
+      </c:scatterChart>
+      <c:valAx>
+        <c:axId val="1473997295"/>
+        <c:scaling>
+          <c:orientation val="minMax"/>
+        </c:scaling>
+        <c:delete val="0"/>
+        <c:axPos val="b"/>
+        <c:majorGridlines>
+          <c:spPr>
+            <a:ln w="9525" cap="flat" cmpd="sng" algn="ctr">
+              <a:solidFill>
+                <a:schemeClr val="tx1">
+                  <a:lumMod val="15000"/>
+                  <a:lumOff val="85000"/>
+                </a:schemeClr>
+              </a:solidFill>
+              <a:round/>
+            </a:ln>
+            <a:effectLst/>
+          </c:spPr>
+        </c:majorGridlines>
+        <c:numFmt formatCode="General" sourceLinked="1"/>
+        <c:majorTickMark val="none"/>
+        <c:minorTickMark val="none"/>
+        <c:tickLblPos val="nextTo"/>
+        <c:spPr>
+          <a:noFill/>
+          <a:ln w="9525" cap="flat" cmpd="sng" algn="ctr">
+            <a:solidFill>
+              <a:schemeClr val="tx1">
+                <a:lumMod val="25000"/>
+                <a:lumOff val="75000"/>
+              </a:schemeClr>
+            </a:solidFill>
+            <a:round/>
+          </a:ln>
+          <a:effectLst/>
+        </c:spPr>
+        <c:txPr>
+          <a:bodyPr rot="-60000000" spcFirstLastPara="1" vertOverflow="ellipsis" vert="horz" wrap="square" anchor="ctr" anchorCtr="1"/>
+          <a:lstStyle/>
+          <a:p>
+            <a:pPr>
+              <a:defRPr sz="900" b="0" i="0" u="none" strike="noStrike" kern="1200" baseline="0">
+                <a:solidFill>
+                  <a:schemeClr val="tx1">
+                    <a:lumMod val="65000"/>
+                    <a:lumOff val="35000"/>
+                  </a:schemeClr>
+                </a:solidFill>
+                <a:latin typeface="+mn-lt"/>
+                <a:ea typeface="+mn-ea"/>
+                <a:cs typeface="+mn-cs"/>
+              </a:defRPr>
+            </a:pPr>
+            <a:endParaRPr lang="en-US"/>
+          </a:p>
+        </c:txPr>
+        <c:crossAx val="1492851327"/>
+        <c:crosses val="autoZero"/>
+        <c:crossBetween val="midCat"/>
+      </c:valAx>
+      <c:valAx>
+        <c:axId val="1492851327"/>
+        <c:scaling>
+          <c:orientation val="minMax"/>
+        </c:scaling>
+        <c:delete val="0"/>
+        <c:axPos val="l"/>
+        <c:majorGridlines>
+          <c:spPr>
+            <a:ln w="9525" cap="flat" cmpd="sng" algn="ctr">
+              <a:solidFill>
+                <a:schemeClr val="tx1">
+                  <a:lumMod val="15000"/>
+                  <a:lumOff val="85000"/>
+                </a:schemeClr>
+              </a:solidFill>
+              <a:round/>
+            </a:ln>
+            <a:effectLst/>
+          </c:spPr>
+        </c:majorGridlines>
+        <c:numFmt formatCode="General" sourceLinked="1"/>
+        <c:majorTickMark val="none"/>
+        <c:minorTickMark val="none"/>
+        <c:tickLblPos val="nextTo"/>
+        <c:spPr>
+          <a:noFill/>
+          <a:ln w="9525" cap="flat" cmpd="sng" algn="ctr">
+            <a:solidFill>
+              <a:schemeClr val="tx1">
+                <a:lumMod val="25000"/>
+                <a:lumOff val="75000"/>
+              </a:schemeClr>
+            </a:solidFill>
+            <a:round/>
+          </a:ln>
+          <a:effectLst/>
+        </c:spPr>
+        <c:txPr>
+          <a:bodyPr rot="-60000000" spcFirstLastPara="1" vertOverflow="ellipsis" vert="horz" wrap="square" anchor="ctr" anchorCtr="1"/>
+          <a:lstStyle/>
+          <a:p>
+            <a:pPr>
+              <a:defRPr sz="900" b="0" i="0" u="none" strike="noStrike" kern="1200" baseline="0">
+                <a:solidFill>
+                  <a:schemeClr val="tx1">
+                    <a:lumMod val="65000"/>
+                    <a:lumOff val="35000"/>
+                  </a:schemeClr>
+                </a:solidFill>
+                <a:latin typeface="+mn-lt"/>
+                <a:ea typeface="+mn-ea"/>
+                <a:cs typeface="+mn-cs"/>
+              </a:defRPr>
+            </a:pPr>
+            <a:endParaRPr lang="en-US"/>
+          </a:p>
+        </c:txPr>
+        <c:crossAx val="1473997295"/>
+        <c:crosses val="autoZero"/>
+        <c:crossBetween val="midCat"/>
+      </c:valAx>
+      <c:spPr>
+        <a:noFill/>
+        <a:ln>
+          <a:noFill/>
+        </a:ln>
+        <a:effectLst/>
+      </c:spPr>
+    </c:plotArea>
+    <c:legend>
+      <c:legendPos val="b"/>
+      <c:overlay val="0"/>
+      <c:spPr>
+        <a:noFill/>
+        <a:ln>
+          <a:noFill/>
+        </a:ln>
+        <a:effectLst/>
+      </c:spPr>
+      <c:txPr>
+        <a:bodyPr rot="0" spcFirstLastPara="1" vertOverflow="ellipsis" vert="horz" wrap="square" anchor="ctr" anchorCtr="1"/>
+        <a:lstStyle/>
+        <a:p>
+          <a:pPr>
+            <a:defRPr sz="900" b="0" i="0" u="none" strike="noStrike" kern="1200" baseline="0">
+              <a:solidFill>
+                <a:schemeClr val="tx1">
+                  <a:lumMod val="65000"/>
+                  <a:lumOff val="35000"/>
+                </a:schemeClr>
+              </a:solidFill>
+              <a:latin typeface="+mn-lt"/>
+              <a:ea typeface="+mn-ea"/>
+              <a:cs typeface="+mn-cs"/>
+            </a:defRPr>
+          </a:pPr>
+          <a:endParaRPr lang="en-US"/>
+        </a:p>
+      </c:txPr>
+    </c:legend>
+    <c:plotVisOnly val="1"/>
+    <c:dispBlanksAs val="gap"/>
+    <c:showDLblsOverMax val="0"/>
+    <c:extLst>
+      <c:ext xmlns:c16r3="http://schemas.microsoft.com/office/drawing/2017/03/chart" uri="{56B9EC1D-385E-4148-901F-78D8002777C0}">
+        <c16r3:dataDisplayOptions16>
+          <c16r3:dispNaAsBlank val="1"/>
+        </c16r3:dataDisplayOptions16>
+      </c:ext>
+    </c:extLst>
+  </c:chart>
+  <c:spPr>
+    <a:solidFill>
+      <a:schemeClr val="bg1"/>
+    </a:solidFill>
+    <a:ln w="9525" cap="flat" cmpd="sng" algn="ctr">
+      <a:solidFill>
+        <a:schemeClr val="tx1">
+          <a:lumMod val="15000"/>
+          <a:lumOff val="85000"/>
+        </a:schemeClr>
+      </a:solidFill>
+      <a:round/>
+    </a:ln>
+    <a:effectLst/>
+  </c:spPr>
+  <c:txPr>
+    <a:bodyPr/>
+    <a:lstStyle/>
+    <a:p>
+      <a:pPr>
+        <a:defRPr/>
+      </a:pPr>
+      <a:endParaRPr lang="en-US"/>
+    </a:p>
+  </c:txPr>
+  <c:externalData r:id="rId3">
+    <c:autoUpdate val="0"/>
+  </c:externalData>
+</c:chartSpace>
+</file>
+
+<file path=word/charts/colors1.xml><?xml version="1.0" encoding="utf-8"?>
+<cs:colorStyle xmlns:cs="http://schemas.microsoft.com/office/drawing/2012/chartStyle" xmlns:a="http://schemas.openxmlformats.org/drawingml/2006/main" meth="cycle" id="10">
+  <a:schemeClr val="accent1"/>
+  <a:schemeClr val="accent2"/>
+  <a:schemeClr val="accent3"/>
+  <a:schemeClr val="accent4"/>
+  <a:schemeClr val="accent5"/>
+  <a:schemeClr val="accent6"/>
+  <cs:variation/>
+  <cs:variation>
+    <a:lumMod val="60000"/>
+  </cs:variation>
+  <cs:variation>
+    <a:lumMod val="80000"/>
+    <a:lumOff val="20000"/>
+  </cs:variation>
+  <cs:variation>
+    <a:lumMod val="80000"/>
+  </cs:variation>
+  <cs:variation>
+    <a:lumMod val="60000"/>
+    <a:lumOff val="40000"/>
+  </cs:variation>
+  <cs:variation>
+    <a:lumMod val="50000"/>
+  </cs:variation>
+  <cs:variation>
+    <a:lumMod val="70000"/>
+    <a:lumOff val="30000"/>
+  </cs:variation>
+  <cs:variation>
+    <a:lumMod val="70000"/>
+  </cs:variation>
+  <cs:variation>
+    <a:lumMod val="50000"/>
+    <a:lumOff val="50000"/>
+  </cs:variation>
+</cs:colorStyle>
+</file>
+
+<file path=word/charts/style1.xml><?xml version="1.0" encoding="utf-8"?>
+<cs:chartStyle xmlns:cs="http://schemas.microsoft.com/office/drawing/2012/chartStyle" xmlns:a="http://schemas.openxmlformats.org/drawingml/2006/main" id="240">
+  <cs:axisTitle>
+    <cs:lnRef idx="0"/>
+    <cs:fillRef idx="0"/>
+    <cs:effectRef idx="0"/>
+    <cs:fontRef idx="minor">
+      <a:schemeClr val="tx1">
+        <a:lumMod val="65000"/>
+        <a:lumOff val="35000"/>
+      </a:schemeClr>
+    </cs:fontRef>
+    <cs:defRPr sz="1000" kern="1200"/>
+  </cs:axisTitle>
+  <cs:categoryAxis>
+    <cs:lnRef idx="0"/>
+    <cs:fillRef idx="0"/>
+    <cs:effectRef idx="0"/>
+    <cs:fontRef idx="minor">
+      <a:schemeClr val="tx1">
+        <a:lumMod val="65000"/>
+        <a:lumOff val="35000"/>
+      </a:schemeClr>
+    </cs:fontRef>
+    <cs:spPr>
+      <a:ln w="9525" cap="flat" cmpd="sng" algn="ctr">
+        <a:solidFill>
+          <a:schemeClr val="tx1">
+            <a:lumMod val="25000"/>
+            <a:lumOff val="75000"/>
+          </a:schemeClr>
+        </a:solidFill>
+        <a:round/>
+      </a:ln>
+    </cs:spPr>
+    <cs:defRPr sz="900" kern="1200"/>
+  </cs:categoryAxis>
+  <cs:chartArea mods="allowNoFillOverride allowNoLineOverride">
+    <cs:lnRef idx="0"/>
+    <cs:fillRef idx="0"/>
+    <cs:effectRef idx="0"/>
+    <cs:fontRef idx="minor">
+      <a:schemeClr val="tx1"/>
+    </cs:fontRef>
+    <cs:spPr>
+      <a:solidFill>
+        <a:schemeClr val="bg1"/>
+      </a:solidFill>
+      <a:ln w="9525" cap="flat" cmpd="sng" algn="ctr">
+        <a:solidFill>
+          <a:schemeClr val="tx1">
+            <a:lumMod val="15000"/>
+            <a:lumOff val="85000"/>
+          </a:schemeClr>
+        </a:solidFill>
+        <a:round/>
+      </a:ln>
+    </cs:spPr>
+    <cs:defRPr sz="1000" kern="1200"/>
+  </cs:chartArea>
+  <cs:dataLabel>
+    <cs:lnRef idx="0"/>
+    <cs:fillRef idx="0"/>
+    <cs:effectRef idx="0"/>
+    <cs:fontRef idx="minor">
+      <a:schemeClr val="tx1">
+        <a:lumMod val="75000"/>
+        <a:lumOff val="25000"/>
+      </a:schemeClr>
+    </cs:fontRef>
+    <cs:defRPr sz="900" kern="1200"/>
+  </cs:dataLabel>
+  <cs:dataLabelCallout>
+    <cs:lnRef idx="0"/>
+    <cs:fillRef idx="0"/>
+    <cs:effectRef idx="0"/>
+    <cs:fontRef idx="minor">
+      <a:schemeClr val="dk1">
+        <a:lumMod val="65000"/>
+        <a:lumOff val="35000"/>
+      </a:schemeClr>
+    </cs:fontRef>
+    <cs:spPr>
+      <a:solidFill>
+        <a:schemeClr val="lt1"/>
+      </a:solidFill>
+      <a:ln>
+        <a:solidFill>
+          <a:schemeClr val="dk1">
+            <a:lumMod val="25000"/>
+            <a:lumOff val="75000"/>
+          </a:schemeClr>
+        </a:solidFill>
+      </a:ln>
+    </cs:spPr>
+    <cs:defRPr sz="900" kern="1200"/>
+    <cs:bodyPr rot="0" spcFirstLastPara="1" vertOverflow="clip" horzOverflow="clip" vert="horz" wrap="square" lIns="36576" tIns="18288" rIns="36576" bIns="18288" anchor="ctr" anchorCtr="1">
+      <a:spAutoFit/>
+    </cs:bodyPr>
+  </cs:dataLabelCallout>
+  <cs:dataPoint>
+    <cs:lnRef idx="0"/>
+    <cs:fillRef idx="1">
+      <cs:styleClr val="auto"/>
+    </cs:fillRef>
+    <cs:effectRef idx="0"/>
+    <cs:fontRef idx="minor">
+      <a:schemeClr val="tx1"/>
+    </cs:fontRef>
+  </cs:dataPoint>
+  <cs:dataPoint3D>
+    <cs:lnRef idx="0"/>
+    <cs:fillRef idx="1">
+      <cs:styleClr val="auto"/>
+    </cs:fillRef>
+    <cs:effectRef idx="0"/>
+    <cs:fontRef idx="minor">
+      <a:schemeClr val="tx1"/>
+    </cs:fontRef>
+  </cs:dataPoint3D>
+  <cs:dataPointLine>
+    <cs:lnRef idx="0">
+      <cs:styleClr val="auto"/>
+    </cs:lnRef>
+    <cs:fillRef idx="1"/>
+    <cs:effectRef idx="0"/>
+    <cs:fontRef idx="minor">
+      <a:schemeClr val="tx1"/>
+    </cs:fontRef>
+    <cs:spPr>
+      <a:ln w="19050" cap="rnd">
+        <a:solidFill>
+          <a:schemeClr val="phClr"/>
+        </a:solidFill>
+        <a:round/>
+      </a:ln>
+    </cs:spPr>
+  </cs:dataPointLine>
+  <cs:dataPointMarker>
+    <cs:lnRef idx="0">
+      <cs:styleClr val="auto"/>
+    </cs:lnRef>
+    <cs:fillRef idx="1">
+      <cs:styleClr val="auto"/>
+    </cs:fillRef>
+    <cs:effectRef idx="0"/>
+    <cs:fontRef idx="minor">
+      <a:schemeClr val="tx1"/>
+    </cs:fontRef>
+    <cs:spPr>
+      <a:ln w="9525">
+        <a:solidFill>
+          <a:schemeClr val="phClr"/>
+        </a:solidFill>
+      </a:ln>
+    </cs:spPr>
+  </cs:dataPointMarker>
+  <cs:dataPointMarkerLayout symbol="circle" size="5"/>
+  <cs:dataPointWireframe>
+    <cs:lnRef idx="0">
+      <cs:styleClr val="auto"/>
+    </cs:lnRef>
+    <cs:fillRef idx="0"/>
+    <cs:effectRef idx="0"/>
+    <cs:fontRef idx="minor">
+      <a:schemeClr val="dk1"/>
+    </cs:fontRef>
+    <cs:spPr>
+      <a:ln w="9525" cap="rnd">
+        <a:solidFill>
+          <a:schemeClr val="phClr"/>
+        </a:solidFill>
+        <a:round/>
+      </a:ln>
+    </cs:spPr>
+  </cs:dataPointWireframe>
+  <cs:dataTable>
+    <cs:lnRef idx="0"/>
+    <cs:fillRef idx="0"/>
+    <cs:effectRef idx="0"/>
+    <cs:fontRef idx="minor">
+      <a:schemeClr val="tx1">
+        <a:lumMod val="65000"/>
+        <a:lumOff val="35000"/>
+      </a:schemeClr>
+    </cs:fontRef>
+    <cs:spPr>
+      <a:noFill/>
+      <a:ln w="9525" cap="flat" cmpd="sng" algn="ctr">
+        <a:solidFill>
+          <a:schemeClr val="tx1">
+            <a:lumMod val="15000"/>
+            <a:lumOff val="85000"/>
+          </a:schemeClr>
+        </a:solidFill>
+        <a:round/>
+      </a:ln>
+    </cs:spPr>
+    <cs:defRPr sz="900" kern="1200"/>
+  </cs:dataTable>
+  <cs:downBar>
+    <cs:lnRef idx="0"/>
+    <cs:fillRef idx="0"/>
+    <cs:effectRef idx="0"/>
+    <cs:fontRef idx="minor">
+      <a:schemeClr val="tx1"/>
+    </cs:fontRef>
+    <cs:spPr>
+      <a:solidFill>
+        <a:schemeClr val="dk1">
+          <a:lumMod val="75000"/>
+          <a:lumOff val="25000"/>
+        </a:schemeClr>
+      </a:solidFill>
+      <a:ln w="9525" cap="flat" cmpd="sng" algn="ctr">
+        <a:solidFill>
+          <a:schemeClr val="tx1">
+            <a:lumMod val="65000"/>
+            <a:lumOff val="35000"/>
+          </a:schemeClr>
+        </a:solidFill>
+        <a:round/>
+      </a:ln>
+    </cs:spPr>
+  </cs:downBar>
+  <cs:dropLine>
+    <cs:lnRef idx="0"/>
+    <cs:fillRef idx="0"/>
+    <cs:effectRef idx="0"/>
+    <cs:fontRef idx="minor">
+      <a:schemeClr val="tx1"/>
+    </cs:fontRef>
+    <cs:spPr>
+      <a:ln w="9525" cap="flat" cmpd="sng" algn="ctr">
+        <a:solidFill>
+          <a:schemeClr val="tx1">
+            <a:lumMod val="35000"/>
+            <a:lumOff val="65000"/>
+          </a:schemeClr>
+        </a:solidFill>
+        <a:round/>
+      </a:ln>
+    </cs:spPr>
+  </cs:dropLine>
+  <cs:errorBar>
+    <cs:lnRef idx="0"/>
+    <cs:fillRef idx="0"/>
+    <cs:effectRef idx="0"/>
+    <cs:fontRef idx="minor">
+      <a:schemeClr val="tx1"/>
+    </cs:fontRef>
+    <cs:spPr>
+      <a:ln w="9525" cap="flat" cmpd="sng" algn="ctr">
+        <a:solidFill>
+          <a:schemeClr val="tx1">
+            <a:lumMod val="65000"/>
+            <a:lumOff val="35000"/>
+          </a:schemeClr>
+        </a:solidFill>
+        <a:round/>
+      </a:ln>
+    </cs:spPr>
+  </cs:errorBar>
+  <cs:floor>
+    <cs:lnRef idx="0"/>
+    <cs:fillRef idx="0"/>
+    <cs:effectRef idx="0"/>
+    <cs:fontRef idx="minor">
+      <a:schemeClr val="tx1"/>
+    </cs:fontRef>
+    <cs:spPr>
+      <a:noFill/>
+      <a:ln>
+        <a:noFill/>
+      </a:ln>
+    </cs:spPr>
+  </cs:floor>
+  <cs:gridlineMajor>
+    <cs:lnRef idx="0"/>
+    <cs:fillRef idx="0"/>
+    <cs:effectRef idx="0"/>
+    <cs:fontRef idx="minor">
+      <a:schemeClr val="tx1"/>
+    </cs:fontRef>
+    <cs:spPr>
+      <a:ln w="9525" cap="flat" cmpd="sng" algn="ctr">
+        <a:solidFill>
+          <a:schemeClr val="tx1">
+            <a:lumMod val="15000"/>
+            <a:lumOff val="85000"/>
+          </a:schemeClr>
+        </a:solidFill>
+        <a:round/>
+      </a:ln>
+    </cs:spPr>
+  </cs:gridlineMajor>
+  <cs:gridlineMinor>
+    <cs:lnRef idx="0"/>
+    <cs:fillRef idx="0"/>
+    <cs:effectRef idx="0"/>
+    <cs:fontRef idx="minor">
+      <a:schemeClr val="tx1"/>
+    </cs:fontRef>
+    <cs:spPr>
+      <a:ln w="9525" cap="flat" cmpd="sng" algn="ctr">
+        <a:solidFill>
+          <a:schemeClr val="tx1">
+            <a:lumMod val="5000"/>
+            <a:lumOff val="95000"/>
+          </a:schemeClr>
+        </a:solidFill>
+        <a:round/>
+      </a:ln>
+    </cs:spPr>
+  </cs:gridlineMinor>
+  <cs:hiLoLine>
+    <cs:lnRef idx="0"/>
+    <cs:fillRef idx="0"/>
+    <cs:effectRef idx="0"/>
+    <cs:fontRef idx="minor">
+      <a:schemeClr val="tx1"/>
+    </cs:fontRef>
+    <cs:spPr>
+      <a:ln w="9525" cap="flat" cmpd="sng" algn="ctr">
+        <a:solidFill>
+          <a:schemeClr val="tx1">
+            <a:lumMod val="50000"/>
+            <a:lumOff val="50000"/>
+          </a:schemeClr>
+        </a:solidFill>
+        <a:round/>
+      </a:ln>
+    </cs:spPr>
+  </cs:hiLoLine>
+  <cs:leaderLine>
+    <cs:lnRef idx="0"/>
+    <cs:fillRef idx="0"/>
+    <cs:effectRef idx="0"/>
+    <cs:fontRef idx="minor">
+      <a:schemeClr val="tx1"/>
+    </cs:fontRef>
+    <cs:spPr>
+      <a:ln w="9525" cap="flat" cmpd="sng" algn="ctr">
+        <a:solidFill>
+          <a:schemeClr val="tx1">
+            <a:lumMod val="35000"/>
+            <a:lumOff val="65000"/>
+          </a:schemeClr>
+        </a:solidFill>
+        <a:round/>
+      </a:ln>
+    </cs:spPr>
+  </cs:leaderLine>
+  <cs:legend>
+    <cs:lnRef idx="0"/>
+    <cs:fillRef idx="0"/>
+    <cs:effectRef idx="0"/>
+    <cs:fontRef idx="minor">
+      <a:schemeClr val="tx1">
+        <a:lumMod val="65000"/>
+        <a:lumOff val="35000"/>
+      </a:schemeClr>
+    </cs:fontRef>
+    <cs:defRPr sz="900" kern="1200"/>
+  </cs:legend>
+  <cs:plotArea mods="allowNoFillOverride allowNoLineOverride">
+    <cs:lnRef idx="0"/>
+    <cs:fillRef idx="0"/>
+    <cs:effectRef idx="0"/>
+    <cs:fontRef idx="minor">
+      <a:schemeClr val="tx1"/>
+    </cs:fontRef>
+  </cs:plotArea>
+  <cs:plotArea3D mods="allowNoFillOverride allowNoLineOverride">
+    <cs:lnRef idx="0"/>
+    <cs:fillRef idx="0"/>
+    <cs:effectRef idx="0"/>
+    <cs:fontRef idx="minor">
+      <a:schemeClr val="tx1"/>
+    </cs:fontRef>
+  </cs:plotArea3D>
+  <cs:seriesAxis>
+    <cs:lnRef idx="0"/>
+    <cs:fillRef idx="0"/>
+    <cs:effectRef idx="0"/>
+    <cs:fontRef idx="minor">
+      <a:schemeClr val="tx1">
+        <a:lumMod val="65000"/>
+        <a:lumOff val="35000"/>
+      </a:schemeClr>
+    </cs:fontRef>
+    <cs:defRPr sz="900" kern="1200"/>
+  </cs:seriesAxis>
+  <cs:seriesLine>
+    <cs:lnRef idx="0"/>
+    <cs:fillRef idx="0"/>
+    <cs:effectRef idx="0"/>
+    <cs:fontRef idx="minor">
+      <a:schemeClr val="tx1"/>
+    </cs:fontRef>
+    <cs:spPr>
+      <a:ln w="9525" cap="flat" cmpd="sng" algn="ctr">
+        <a:solidFill>
+          <a:schemeClr val="tx1">
+            <a:lumMod val="35000"/>
+            <a:lumOff val="65000"/>
+          </a:schemeClr>
+        </a:solidFill>
+        <a:round/>
+      </a:ln>
+    </cs:spPr>
+  </cs:seriesLine>
+  <cs:title>
+    <cs:lnRef idx="0"/>
+    <cs:fillRef idx="0"/>
+    <cs:effectRef idx="0"/>
+    <cs:fontRef idx="minor">
+      <a:schemeClr val="tx1">
+        <a:lumMod val="65000"/>
+        <a:lumOff val="35000"/>
+      </a:schemeClr>
+    </cs:fontRef>
+    <cs:defRPr sz="1400" b="0" kern="1200" spc="0" baseline="0"/>
+  </cs:title>
+  <cs:trendline>
+    <cs:lnRef idx="0">
+      <cs:styleClr val="auto"/>
+    </cs:lnRef>
+    <cs:fillRef idx="0"/>
+    <cs:effectRef idx="0"/>
+    <cs:fontRef idx="minor">
+      <a:schemeClr val="tx1"/>
+    </cs:fontRef>
+    <cs:spPr>
+      <a:ln w="19050" cap="rnd">
+        <a:solidFill>
+          <a:schemeClr val="phClr"/>
+        </a:solidFill>
+        <a:prstDash val="sysDot"/>
+      </a:ln>
+    </cs:spPr>
+  </cs:trendline>
+  <cs:trendlineLabel>
+    <cs:lnRef idx="0"/>
+    <cs:fillRef idx="0"/>
+    <cs:effectRef idx="0"/>
+    <cs:fontRef idx="minor">
+      <a:schemeClr val="tx1">
+        <a:lumMod val="65000"/>
+        <a:lumOff val="35000"/>
+      </a:schemeClr>
+    </cs:fontRef>
+    <cs:defRPr sz="900" kern="1200"/>
+  </cs:trendlineLabel>
+  <cs:upBar>
+    <cs:lnRef idx="0"/>
+    <cs:fillRef idx="0"/>
+    <cs:effectRef idx="0"/>
+    <cs:fontRef idx="minor">
+      <a:schemeClr val="tx1"/>
+    </cs:fontRef>
+    <cs:spPr>
+      <a:solidFill>
+        <a:schemeClr val="lt1"/>
+      </a:solidFill>
+      <a:ln w="9525" cap="flat" cmpd="sng" algn="ctr">
+        <a:solidFill>
+          <a:schemeClr val="tx1">
+            <a:lumMod val="65000"/>
+            <a:lumOff val="35000"/>
+          </a:schemeClr>
+        </a:solidFill>
+        <a:round/>
+      </a:ln>
+    </cs:spPr>
+  </cs:upBar>
+  <cs:valueAxis>
+    <cs:lnRef idx="0"/>
+    <cs:fillRef idx="0"/>
+    <cs:effectRef idx="0"/>
+    <cs:fontRef idx="minor">
+      <a:schemeClr val="tx1">
+        <a:lumMod val="65000"/>
+        <a:lumOff val="35000"/>
+      </a:schemeClr>
+    </cs:fontRef>
+    <cs:spPr>
+      <a:ln w="9525" cap="flat" cmpd="sng" algn="ctr">
+        <a:solidFill>
+          <a:schemeClr val="tx1">
+            <a:lumMod val="25000"/>
+            <a:lumOff val="75000"/>
+          </a:schemeClr>
+        </a:solidFill>
+        <a:round/>
+      </a:ln>
+    </cs:spPr>
+    <cs:defRPr sz="900" kern="1200"/>
+  </cs:valueAxis>
+  <cs:wall>
+    <cs:lnRef idx="0"/>
+    <cs:fillRef idx="0"/>
+    <cs:effectRef idx="0"/>
+    <cs:fontRef idx="minor">
+      <a:schemeClr val="tx1"/>
+    </cs:fontRef>
+    <cs:spPr>
+      <a:noFill/>
+      <a:ln>
+        <a:noFill/>
+      </a:ln>
+    </cs:spPr>
+  </cs:wall>
+</cs:chartStyle>
 </file>
 
 <file path=word/theme/theme1.xml><?xml version="1.0" encoding="utf-8"?>

</xml_diff>